<commit_message>
students: review pass — fictional domains and IDs, corrected facts and menu paths, honest jq-based hook, round steps reordered
✨ Generated with Claude Code (claude.ai/claude-code) 2.1.274 (Fable 5.1 ⌞max⌝)
Claude-Session: https://claude.ai/code/session_01VCYovuomnLzabJCmDkcKCC
</commit_message>
<xml_diff>
--- a/students/materials/ronde-3/cv-rizky-pratama.docx
+++ b/students/materials/ronde-3/cv-rizky-pratama.docx
@@ -47,7 +47,7 @@
           <w:color w:val="555555"/>
           <w:sz w:val="17"/>
         </w:rPr>
-        <w:t>rizky.pratama@contoh.id  |  0813-0000-1234  |  Jakarta, Indonesia  |  linkedin.com/in/rizkypratama-contoh</w:t>
+        <w:t>rizky.pratama@contoh.example  |  0813-0000-1234  |  Jakarta, Indonesia  |  linkedin.com/in/rizkypratama-contoh</w:t>
       </w:r>
     </w:p>
     <w:p>
@@ -230,6 +230,9 @@
       </w:r>
     </w:p>
     <w:p>
+      <w:pPr>
+        <w:spacing w:before="0" w:after="0"/>
+      </w:pPr>
       <w:r>
         <w:rPr>
           <w:color w:val="FFFFFF"/>
@@ -329,7 +332,7 @@
           <w:color w:val="222222"/>
           <w:sz w:val="19"/>
         </w:rPr>
-        <w:t xml:space="preserve"> dari 3 bulan data transaksi kantin (fiktif, 8.000 baris) dan query laporan penjualan harian</w:t>
+        <w:t xml:space="preserve"> dari 3 bulan data transaksi kantin (8.000 baris) dan query laporan penjualan harian</w:t>
       </w:r>
     </w:p>
     <w:p>
@@ -694,7 +697,7 @@
       </w:r>
     </w:p>
     <w:sectPr>
-      <w:pgSz w:w="12240" w:h="15840"/>
+      <w:pgSz w:w="11906" w:h="16838"/>
       <w:pgMar w:top="800" w:right="960" w:bottom="800" w:left="960" w:header="720" w:footer="720" w:gutter="0"/>
       <w:cols w:space="720"/>
       <w:docGrid w:linePitch="360"/>

</xml_diff>